<commit_message>
docs(sprint-2): enlaces clicables en la portada A
</commit_message>
<xml_diff>
--- a/deliverables/sprint-2/Entregable-A-Portada-Sprint2.docx
+++ b/deliverables/sprint-2/Entregable-A-Portada-Sprint2.docx
@@ -295,7 +295,6 @@
       <w:r>
         <w:rPr>
           <w:b w:val="0"/>
-          <w:i w:val="0"/>
           <w:sz w:val="22"/>
         </w:rPr>
         <w:t>La documentación del proyecto se mantiene en GitHub (wiki y repositorio) en lugar de un anexo tradicional, por ser más profesional, trazable y fácil de mantener actualizada.</w:t>
@@ -315,7 +314,6 @@
       <w:r>
         <w:rPr>
           <w:b w:val="0"/>
-          <w:i w:val="0"/>
           <w:sz w:val="22"/>
         </w:rPr>
         <w:t>Disponible en la wiki del proyecto (requisitos, arquitectura, UML, backlog, épicas/historias y base de datos):</w:t>
@@ -325,21 +323,39 @@
       <w:r>
         <w:rPr>
           <w:b/>
-          <w:i w:val="0"/>
           <w:sz w:val="22"/>
         </w:rPr>
-        <w:t>Wiki (inicio): https://github.com/Jenifrutica/ritech-marketplace/wiki/Home</w:t>
+        <w:t xml:space="preserve">Wiki (inicio): </w:t>
       </w:r>
+      <w:hyperlink r:id="rId9">
+        <w:r>
+          <w:rPr>
+            <w:color w:val="0563C1"/>
+            <w:u w:val="single"/>
+            <w:sz w:val="22"/>
+          </w:rPr>
+          <w:t>https://github.com/Jenifrutica/ritech-marketplace/wiki/Home</w:t>
+        </w:r>
+      </w:hyperlink>
     </w:p>
     <w:p>
       <w:r>
         <w:rPr>
           <w:b/>
-          <w:i w:val="0"/>
           <w:sz w:val="22"/>
         </w:rPr>
-        <w:t>Repositorio: https://github.com/Jenifrutica/ritech-marketplace</w:t>
+        <w:t xml:space="preserve">Repositorio: </w:t>
       </w:r>
+      <w:hyperlink r:id="rId10">
+        <w:r>
+          <w:rPr>
+            <w:color w:val="0563C1"/>
+            <w:u w:val="single"/>
+            <w:sz w:val="22"/>
+          </w:rPr>
+          <w:t>https://github.com/Jenifrutica/ritech-marketplace</w:t>
+        </w:r>
+      </w:hyperlink>
     </w:p>
     <w:p>
       <w:r>
@@ -355,7 +371,6 @@
       <w:r>
         <w:rPr>
           <w:b w:val="0"/>
-          <w:i w:val="0"/>
           <w:sz w:val="22"/>
         </w:rPr>
         <w:t>Hoja de cálculo en formato de tablas (blanco y negro) con los casos de prueba por módulo, matriz de trazabilidad y resumen. Archivo: Entregable-B-Plan-de-Pruebas-Sprint2.xlsx.</w:t>
@@ -375,11 +390,22 @@
       <w:r>
         <w:rPr>
           <w:b w:val="0"/>
-          <w:i w:val="0"/>
           <w:sz w:val="22"/>
         </w:rPr>
-        <w:t>El código y la demostración corresponden al mismo repositorio de GitHub: https://github.com/Jenifrutica/ritech-marketplace</w:t>
+        <w:t>El código y la demostración corresponden al mismo repositorio de GitHub:</w:t>
       </w:r>
+    </w:p>
+    <w:p>
+      <w:hyperlink r:id="rId10">
+        <w:r>
+          <w:rPr>
+            <w:color w:val="0563C1"/>
+            <w:u w:val="single"/>
+            <w:sz w:val="22"/>
+          </w:rPr>
+          <w:t>https://github.com/Jenifrutica/ritech-marketplace</w:t>
+        </w:r>
+      </w:hyperlink>
     </w:p>
     <w:p>
       <w:r>
@@ -401,9 +427,16 @@
         </w:rPr>
         <w:t xml:space="preserve">1. Requerimientos funcionales, no funcionales y restricciones — </w:t>
       </w:r>
-      <w:r>
-        <w:t>https://github.com/Jenifrutica/ritech-marketplace/wiki/Requisitos</w:t>
-      </w:r>
+      <w:hyperlink r:id="rId11">
+        <w:r>
+          <w:rPr>
+            <w:color w:val="0563C1"/>
+            <w:u w:val="single"/>
+            <w:sz w:val="22"/>
+          </w:rPr>
+          <w:t>https://github.com/Jenifrutica/ritech-marketplace/wiki/Requisitos</w:t>
+        </w:r>
+      </w:hyperlink>
     </w:p>
     <w:p>
       <w:pPr>
@@ -415,9 +448,16 @@
         </w:rPr>
         <w:t xml:space="preserve">2. Diagramas UML: actores y casos de uso — </w:t>
       </w:r>
-      <w:r>
-        <w:t>https://github.com/Jenifrutica/ritech-marketplace/wiki/Diagramas</w:t>
-      </w:r>
+      <w:hyperlink r:id="rId12">
+        <w:r>
+          <w:rPr>
+            <w:color w:val="0563C1"/>
+            <w:u w:val="single"/>
+            <w:sz w:val="22"/>
+          </w:rPr>
+          <w:t>https://github.com/Jenifrutica/ritech-marketplace/wiki/Diagramas</w:t>
+        </w:r>
+      </w:hyperlink>
     </w:p>
     <w:p>
       <w:pPr>
@@ -429,9 +469,16 @@
         </w:rPr>
         <w:t xml:space="preserve">3. Backlog trabajado en septiembre y responsables — </w:t>
       </w:r>
-      <w:r>
-        <w:t>https://github.com/Jenifrutica/ritech-marketplace/wiki/Product-Backlog-Jira-LIT</w:t>
-      </w:r>
+      <w:hyperlink r:id="rId13">
+        <w:r>
+          <w:rPr>
+            <w:color w:val="0563C1"/>
+            <w:u w:val="single"/>
+            <w:sz w:val="22"/>
+          </w:rPr>
+          <w:t>https://github.com/Jenifrutica/ritech-marketplace/wiki/Product-Backlog-Jira-LIT</w:t>
+        </w:r>
+      </w:hyperlink>
     </w:p>
     <w:p>
       <w:pPr>
@@ -443,9 +490,16 @@
         </w:rPr>
         <w:t xml:space="preserve">4. Épicas e historias de usuario con criterios de aceptación — </w:t>
       </w:r>
-      <w:r>
-        <w:t>https://github.com/Jenifrutica/ritech-marketplace/wiki/Product-Backlog-Jira-LIT</w:t>
-      </w:r>
+      <w:hyperlink r:id="rId13">
+        <w:r>
+          <w:rPr>
+            <w:color w:val="0563C1"/>
+            <w:u w:val="single"/>
+            <w:sz w:val="22"/>
+          </w:rPr>
+          <w:t>https://github.com/Jenifrutica/ritech-marketplace/wiki/Product-Backlog-Jira-LIT</w:t>
+        </w:r>
+      </w:hyperlink>
     </w:p>
     <w:p>
       <w:pPr>
@@ -457,9 +511,16 @@
         </w:rPr>
         <w:t xml:space="preserve">5. Estructura de la base de datos (tablas y relaciones) — </w:t>
       </w:r>
-      <w:r>
-        <w:t>https://github.com/Jenifrutica/ritech-marketplace/wiki/Arquitectura</w:t>
-      </w:r>
+      <w:hyperlink r:id="rId14">
+        <w:r>
+          <w:rPr>
+            <w:color w:val="0563C1"/>
+            <w:u w:val="single"/>
+            <w:sz w:val="22"/>
+          </w:rPr>
+          <w:t>https://github.com/Jenifrutica/ritech-marketplace/wiki/Arquitectura</w:t>
+        </w:r>
+      </w:hyperlink>
     </w:p>
     <w:sectPr>
       <w:pgSz w:w="12240" w:h="15840"/>

</xml_diff>